<commit_message>
docs: update repos.html to showcase RepMax AI as top project; remove Mitch branding
</commit_message>
<xml_diff>
--- a/resources/resume.docx
+++ b/resources/resume.docx
@@ -436,23 +436,9 @@
           <w:color w:val="000000" w:themeColor="text1"/>
           <w:sz w:val="22"/>
           <w:szCs w:val="22"/>
-          <w:highlight w:val="none"/>
-        </w:rPr>
-      </w:r>
-      <w:r>
-        <w:rPr>
-          <w:rFonts w:ascii="Times New Roman" w:hAnsi="Times New Roman" w:eastAsia="Times New Roman" w:cs="Times New Roman"/>
-          <w:b/>
-          <w:bCs/>
-          <w:i w:val="0"/>
-          <w:iCs w:val="0"/>
-          <w:color w:val="000000" w:themeColor="text1"/>
-          <w:sz w:val="22"/>
-          <w:szCs w:val="22"/>
         </w:rPr>
         <w:t xml:space="preserve">–</w:t>
       </w:r>
-      <w:r/>
       <w:r>
         <w:rPr>
           <w:rFonts w:ascii="Times New Roman" w:hAnsi="Times New Roman" w:eastAsia="Times New Roman" w:cs="Times New Roman"/>
@@ -466,6 +452,18 @@
           <w:highlight w:val="none"/>
         </w:rPr>
         <w:t xml:space="preserve"> Present</w:t>
+      </w:r>
+      <w:r>
+        <w:rPr>
+          <w:rFonts w:ascii="Times New Roman" w:hAnsi="Times New Roman" w:eastAsia="Times New Roman" w:cs="Times New Roman"/>
+          <w:b/>
+          <w:bCs w:val="0"/>
+          <w:i w:val="0"/>
+          <w:color w:val="000000" w:themeColor="text1"/>
+          <w:sz w:val="22"/>
+          <w:szCs w:val="22"/>
+          <w:highlight w:val="none"/>
+        </w:rPr>
       </w:r>
       <w:r>
         <w:rPr>
@@ -537,10 +535,9 @@
       <w:r>
         <w:rPr>
           <w:rFonts w:ascii="Times New Roman" w:hAnsi="Times New Roman" w:eastAsia="Times New Roman" w:cs="Times New Roman"/>
-          <w:b/>
-          <w:bCs/>
+          <w:b w:val="0"/>
+          <w:bCs w:val="0"/>
           <w:i w:val="0"/>
-          <w:iCs w:val="0"/>
           <w:color w:val="000000" w:themeColor="text1"/>
           <w:sz w:val="22"/>
           <w:szCs w:val="22"/>
@@ -2262,7 +2259,383 @@
         <w:contextualSpacing w:val="false"/>
         <w:jc w:val="left"/>
         <w:rPr>
+          <w:rFonts w:ascii="Times New Roman" w:hAnsi="Times New Roman" w:eastAsia="Times New Roman" w:cs="Times New Roman"/>
+          <w:b/>
+          <w:bCs/>
+          <w:color w:val="000000" w:themeColor="text1"/>
+          <w:sz w:val="22"/>
+          <w:szCs w:val="22"/>
+          <w:highlight w:val="none"/>
+          <w:u w:val="none"/>
+        </w:rPr>
+      </w:pPr>
+      <w:r>
+        <w:rPr>
+          <w:rFonts w:ascii="Times New Roman" w:hAnsi="Times New Roman" w:eastAsia="Times New Roman" w:cs="Times New Roman"/>
+          <w:b/>
+          <w:bCs/>
+          <w:color w:val="000000" w:themeColor="text1"/>
+          <w:sz w:val="22"/>
+          <w:szCs w:val="22"/>
+          <w:highlight w:val="none"/>
+          <w:u w:val="none"/>
+        </w:rPr>
+        <w:t xml:space="preserve">RepMax</w:t>
+      </w:r>
+      <w:r>
+        <w:rPr>
           <w:rFonts w:ascii="Times New Roman" w:hAnsi="Times New Roman" w:cs="Times New Roman"/>
+          <w:b/>
+          <w:bCs/>
+          <w:color w:val="000000" w:themeColor="text1"/>
+          <w:sz w:val="22"/>
+          <w:szCs w:val="22"/>
+          <w:highlight w:val="none"/>
+          <w:u w:val="none"/>
+        </w:rPr>
+        <w:t xml:space="preserve"> AI</w:t>
+      </w:r>
+      <w:r>
+        <w:rPr>
+          <w:rFonts w:ascii="Times New Roman" w:hAnsi="Times New Roman" w:eastAsia="Times New Roman" w:cs="Times New Roman"/>
+          <w:b/>
+          <w:bCs/>
+          <w:color w:val="000000" w:themeColor="text1"/>
+          <w:sz w:val="22"/>
+          <w:szCs w:val="22"/>
+          <w:highlight w:val="none"/>
+          <w:u w:val="none"/>
+        </w:rPr>
+        <w:tab/>
+      </w:r>
+      <w:hyperlink r:id="rId14" w:tooltip="https://github.com/mrf-dot/repmax-ai" w:history="1">
+        <w:r>
+          <w:rPr>
+            <w:rStyle w:val="988"/>
+            <w:rFonts w:ascii="Times New Roman" w:hAnsi="Times New Roman" w:eastAsia="Times New Roman" w:cs="Times New Roman"/>
+            <w:b/>
+            <w:bCs/>
+            <w:color w:val="000000" w:themeColor="text1"/>
+            <w:sz w:val="22"/>
+            <w:szCs w:val="22"/>
+            <w:highlight w:val="none"/>
+            <w:u w:val="none"/>
+          </w:rPr>
+          <w:t xml:space="preserve">github.com/mrf-dot/repmax-ai</w:t>
+        </w:r>
+      </w:hyperlink>
+      <w:r>
+        <w:rPr>
+          <w:rFonts w:ascii="Times New Roman" w:hAnsi="Times New Roman" w:eastAsia="Times New Roman" w:cs="Times New Roman"/>
+          <w:b/>
+          <w:bCs/>
+          <w:color w:val="000000" w:themeColor="text1"/>
+          <w:sz w:val="22"/>
+          <w:szCs w:val="22"/>
+          <w:highlight w:val="none"/>
+          <w:u w:val="none"/>
+        </w:rPr>
+      </w:r>
+      <w:r>
+        <w:rPr>
+          <w:rFonts w:ascii="Times New Roman" w:hAnsi="Times New Roman" w:eastAsia="Times New Roman" w:cs="Times New Roman"/>
+          <w:b/>
+          <w:bCs/>
+          <w:color w:val="000000" w:themeColor="text1"/>
+          <w:sz w:val="22"/>
+          <w:szCs w:val="22"/>
+          <w:highlight w:val="none"/>
+          <w:u w:val="none"/>
+        </w:rPr>
+      </w:r>
+    </w:p>
+    <w:p>
+      <w:pPr>
+        <w:pStyle w:val="1009"/>
+        <w:keepNext w:val="false"/>
+        <w:keepLines w:val="true"/>
+        <w:suppressLineNumbers w:val="false"/>
+        <w:pBdr/>
+        <w:tabs>
+          <w:tab w:val="right" w:leader="none" w:pos="12240"/>
+        </w:tabs>
+        <w:spacing w:after="0" w:before="0" w:line="240" w:lineRule="auto"/>
+        <w:ind w:firstLine="0" w:left="0"/>
+        <w:contextualSpacing w:val="false"/>
+        <w:jc w:val="left"/>
+        <w:rPr>
+          <w:rFonts w:ascii="Times New Roman" w:hAnsi="Times New Roman" w:eastAsia="Times New Roman" w:cs="Times New Roman"/>
+          <w:b/>
+          <w:bCs/>
+          <w:color w:val="000000" w:themeColor="text1"/>
+          <w:sz w:val="22"/>
+          <w:szCs w:val="22"/>
+          <w:highlight w:val="none"/>
+          <w:u w:val="none"/>
+        </w:rPr>
+      </w:pPr>
+      <w:r>
+        <w:rPr>
+          <w:rFonts w:ascii="Times New Roman" w:hAnsi="Times New Roman" w:eastAsia="Times New Roman" w:cs="Times New Roman"/>
+          <w:b w:val="0"/>
+          <w:bCs w:val="0"/>
+          <w:i/>
+          <w:iCs/>
+          <w:color w:val="000000" w:themeColor="text1"/>
+          <w:sz w:val="22"/>
+          <w:szCs w:val="22"/>
+          <w:highlight w:val="none"/>
+          <w:u w:val="none"/>
+        </w:rPr>
+        <w:t xml:space="preserve">Local AI-powered workout planner</w:t>
+      </w:r>
+      <w:r>
+        <w:rPr>
+          <w:rFonts w:ascii="Times New Roman" w:hAnsi="Times New Roman" w:eastAsia="Times New Roman" w:cs="Times New Roman"/>
+          <w:b/>
+          <w:bCs/>
+          <w:color w:val="000000" w:themeColor="text1"/>
+          <w:sz w:val="22"/>
+          <w:szCs w:val="22"/>
+          <w:highlight w:val="none"/>
+          <w:u w:val="none"/>
+        </w:rPr>
+        <w:tab/>
+        <w:t xml:space="preserve">March 2026 </w:t>
+      </w:r>
+      <w:r>
+        <w:rPr>
+          <w:rFonts w:ascii="Times New Roman" w:hAnsi="Times New Roman" w:eastAsia="Times New Roman" w:cs="Times New Roman"/>
+          <w:b/>
+          <w:bCs/>
+          <w:i w:val="0"/>
+          <w:iCs w:val="0"/>
+          <w:color w:val="000000" w:themeColor="text1"/>
+          <w:sz w:val="22"/>
+          <w:szCs w:val="22"/>
+        </w:rPr>
+        <w:t xml:space="preserve">–</w:t>
+      </w:r>
+      <w:r>
+        <w:rPr>
+          <w:rFonts w:ascii="Times New Roman" w:hAnsi="Times New Roman" w:eastAsia="Times New Roman" w:cs="Times New Roman"/>
+          <w:b/>
+          <w:bCs/>
+          <w:color w:val="000000" w:themeColor="text1"/>
+          <w:sz w:val="22"/>
+          <w:szCs w:val="22"/>
+          <w:highlight w:val="none"/>
+          <w:u w:val="none"/>
+        </w:rPr>
+        <w:t xml:space="preserve"> April 2026</w:t>
+        <w:tab/>
+      </w:r>
+      <w:r>
+        <w:rPr>
+          <w:rFonts w:ascii="Times New Roman" w:hAnsi="Times New Roman" w:eastAsia="Times New Roman" w:cs="Times New Roman"/>
+          <w:b/>
+          <w:bCs/>
+          <w:color w:val="000000" w:themeColor="text1"/>
+          <w:sz w:val="22"/>
+          <w:szCs w:val="22"/>
+          <w:highlight w:val="none"/>
+          <w:u w:val="none"/>
+        </w:rPr>
+      </w:r>
+      <w:r>
+        <w:rPr>
+          <w:rFonts w:ascii="Times New Roman" w:hAnsi="Times New Roman" w:eastAsia="Times New Roman" w:cs="Times New Roman"/>
+          <w:b/>
+          <w:bCs/>
+          <w:color w:val="000000" w:themeColor="text1"/>
+          <w:sz w:val="22"/>
+          <w:szCs w:val="22"/>
+          <w:highlight w:val="none"/>
+          <w:u w:val="none"/>
+        </w:rPr>
+      </w:r>
+    </w:p>
+    <w:p>
+      <w:pPr>
+        <w:pStyle w:val="1009"/>
+        <w:keepNext w:val="false"/>
+        <w:keepLines w:val="true"/>
+        <w:numPr>
+          <w:ilvl w:val="0"/>
+          <w:numId w:val="61"/>
+        </w:numPr>
+        <w:suppressLineNumbers w:val="false"/>
+        <w:pBdr/>
+        <w:tabs>
+          <w:tab w:val="right" w:leader="none" w:pos="12240"/>
+        </w:tabs>
+        <w:spacing w:after="0" w:before="0" w:line="240" w:lineRule="auto"/>
+        <w:ind/>
+        <w:contextualSpacing w:val="false"/>
+        <w:jc w:val="left"/>
+        <w:rPr>
+          <w:rFonts w:ascii="Times New Roman" w:hAnsi="Times New Roman" w:eastAsia="Times New Roman" w:cs="Times New Roman"/>
+          <w:b/>
+          <w:bCs/>
+          <w:color w:val="000000" w:themeColor="text1"/>
+          <w:sz w:val="22"/>
+          <w:szCs w:val="22"/>
+          <w:highlight w:val="none"/>
+          <w:u w:val="none"/>
+        </w:rPr>
+      </w:pPr>
+      <w:r>
+        <w:rPr>
+          <w:rFonts w:ascii="Times New Roman" w:hAnsi="Times New Roman" w:eastAsia="Times New Roman" w:cs="Times New Roman"/>
+          <w:b w:val="0"/>
+          <w:bCs w:val="0"/>
+          <w:color w:val="000000" w:themeColor="text1"/>
+          <w:sz w:val="22"/>
+          <w:szCs w:val="22"/>
+          <w:highlight w:val="none"/>
+          <w:u w:val="none"/>
+        </w:rPr>
+        <w:t xml:space="preserve">Full-stack MVP (Minimum Viable Product) to generate a personalized workout plan based on individual goals.</w:t>
+      </w:r>
+      <w:r>
+        <w:rPr>
+          <w:rFonts w:ascii="Times New Roman" w:hAnsi="Times New Roman" w:eastAsia="Times New Roman" w:cs="Times New Roman"/>
+          <w:b/>
+          <w:bCs/>
+          <w:color w:val="000000" w:themeColor="text1"/>
+          <w:sz w:val="22"/>
+          <w:szCs w:val="22"/>
+          <w:highlight w:val="none"/>
+          <w:u w:val="none"/>
+        </w:rPr>
+      </w:r>
+    </w:p>
+    <w:p>
+      <w:pPr>
+        <w:pStyle w:val="1009"/>
+        <w:keepNext w:val="false"/>
+        <w:keepLines w:val="true"/>
+        <w:numPr>
+          <w:ilvl w:val="0"/>
+          <w:numId w:val="61"/>
+        </w:numPr>
+        <w:suppressLineNumbers w:val="false"/>
+        <w:pBdr/>
+        <w:tabs>
+          <w:tab w:val="right" w:leader="none" w:pos="12240"/>
+        </w:tabs>
+        <w:spacing w:after="0" w:before="0" w:line="240" w:lineRule="auto"/>
+        <w:ind/>
+        <w:contextualSpacing w:val="false"/>
+        <w:jc w:val="left"/>
+        <w:rPr>
+          <w:rFonts w:ascii="Times New Roman" w:hAnsi="Times New Roman" w:eastAsia="Times New Roman" w:cs="Times New Roman"/>
+          <w:b/>
+          <w:bCs/>
+          <w:color w:val="000000" w:themeColor="text1"/>
+          <w:sz w:val="22"/>
+          <w:szCs w:val="22"/>
+          <w:highlight w:val="none"/>
+          <w:u w:val="none"/>
+        </w:rPr>
+      </w:pPr>
+      <w:r>
+        <w:rPr>
+          <w:rFonts w:ascii="Times New Roman" w:hAnsi="Times New Roman" w:eastAsia="Times New Roman" w:cs="Times New Roman"/>
+          <w:b w:val="0"/>
+          <w:bCs w:val="0"/>
+          <w:color w:val="000000" w:themeColor="text1"/>
+          <w:sz w:val="22"/>
+          <w:szCs w:val="22"/>
+          <w:highlight w:val="none"/>
+          <w:u w:val="none"/>
+        </w:rPr>
+        <w:t xml:space="preserve">Implements a robust AI integration with deterministic offline fallback</w:t>
+      </w:r>
+      <w:r>
+        <w:rPr>
+          <w:rFonts w:ascii="Times New Roman" w:hAnsi="Times New Roman" w:eastAsia="Times New Roman" w:cs="Times New Roman"/>
+          <w:b/>
+          <w:bCs/>
+          <w:color w:val="000000" w:themeColor="text1"/>
+          <w:sz w:val="22"/>
+          <w:szCs w:val="22"/>
+          <w:highlight w:val="none"/>
+          <w:u w:val="none"/>
+        </w:rPr>
+      </w:r>
+    </w:p>
+    <w:p>
+      <w:pPr>
+        <w:pStyle w:val="1009"/>
+        <w:keepNext w:val="false"/>
+        <w:keepLines w:val="true"/>
+        <w:numPr>
+          <w:ilvl w:val="0"/>
+          <w:numId w:val="61"/>
+        </w:numPr>
+        <w:suppressLineNumbers w:val="false"/>
+        <w:pBdr/>
+        <w:tabs>
+          <w:tab w:val="right" w:leader="none" w:pos="12240"/>
+        </w:tabs>
+        <w:spacing w:after="0" w:before="0" w:line="240" w:lineRule="auto"/>
+        <w:ind/>
+        <w:contextualSpacing w:val="false"/>
+        <w:jc w:val="left"/>
+        <w:rPr>
+          <w:rFonts w:ascii="Times New Roman" w:hAnsi="Times New Roman" w:eastAsia="Times New Roman" w:cs="Times New Roman"/>
+          <w:b/>
+          <w:bCs/>
+          <w:color w:val="000000" w:themeColor="text1"/>
+          <w:sz w:val="22"/>
+          <w:szCs w:val="22"/>
+          <w:highlight w:val="none"/>
+          <w:u w:val="none"/>
+        </w:rPr>
+      </w:pPr>
+      <w:r>
+        <w:rPr>
+          <w:rFonts w:ascii="Times New Roman" w:hAnsi="Times New Roman" w:eastAsia="Times New Roman" w:cs="Times New Roman"/>
+          <w:b w:val="0"/>
+          <w:bCs w:val="0"/>
+          <w:color w:val="000000" w:themeColor="text1"/>
+          <w:sz w:val="22"/>
+          <w:szCs w:val="22"/>
+          <w:highlight w:val="none"/>
+          <w:u w:val="none"/>
+        </w:rPr>
+        <w:t xml:space="preserve">Utilizes a REST API for structured JSON responses and caching to save tokens and improve speed.</w:t>
+      </w:r>
+      <w:r>
+        <w:rPr>
+          <w:rFonts w:ascii="Times New Roman" w:hAnsi="Times New Roman" w:eastAsia="Times New Roman" w:cs="Times New Roman"/>
+          <w:b w:val="0"/>
+          <w:bCs w:val="0"/>
+          <w:color w:val="000000" w:themeColor="text1"/>
+          <w:sz w:val="22"/>
+          <w:szCs w:val="22"/>
+          <w:highlight w:val="none"/>
+          <w:u w:val="none"/>
+        </w:rPr>
+      </w:r>
+    </w:p>
+    <w:p>
+      <w:pPr>
+        <w:pStyle w:val="1009"/>
+        <w:keepNext w:val="false"/>
+        <w:keepLines w:val="true"/>
+        <w:suppressLineNumbers w:val="false"/>
+        <w:pBdr/>
+        <w:tabs>
+          <w:tab w:val="right" w:leader="none" w:pos="12240"/>
+        </w:tabs>
+        <w:spacing w:after="0" w:before="0" w:line="240" w:lineRule="auto"/>
+        <w:ind w:firstLine="0" w:left="0"/>
+        <w:contextualSpacing w:val="false"/>
+        <w:jc w:val="left"/>
+        <w:rPr>
+          <w:rFonts w:ascii="Times New Roman" w:hAnsi="Times New Roman" w:eastAsia="Times New Roman" w:cs="Times New Roman"/>
           <w:b/>
           <w:bCs/>
           <w:color w:val="000000" w:themeColor="text1"/>
@@ -2419,7 +2792,7 @@
           <w:u w:val="none"/>
         </w:rPr>
       </w:r>
-      <w:hyperlink r:id="rId14" w:tooltip="https://github.com/mrf-dot/proguide" w:history="1">
+      <w:hyperlink r:id="rId15" w:tooltip="https://github.com/mrf-dot/proguide" w:history="1">
         <w:r>
           <w:rPr>
             <w:rStyle w:val="988"/>
@@ -2540,7 +2913,7 @@
         <w:tabs>
           <w:tab w:val="right" w:leader="none" w:pos="12240"/>
         </w:tabs>
-        <w:spacing w:after="0" w:before="0" w:line="240" w:lineRule="auto"/>
+        <w:spacing w:after="0" w:before="0" w:line="360" w:lineRule="auto"/>
         <w:ind/>
         <w:contextualSpacing w:val="false"/>
         <w:jc w:val="left"/>
@@ -2590,623 +2963,6 @@
           <w:sz w:val="22"/>
           <w:szCs w:val="22"/>
           <w:highlight w:val="none"/>
-        </w:rPr>
-      </w:r>
-    </w:p>
-    <w:p>
-      <w:pPr>
-        <w:pStyle w:val="1009"/>
-        <w:keepNext w:val="false"/>
-        <w:keepLines w:val="true"/>
-        <w:suppressLineNumbers w:val="false"/>
-        <w:pBdr/>
-        <w:tabs>
-          <w:tab w:val="right" w:leader="none" w:pos="11520"/>
-          <w:tab w:val="right" w:leader="none" w:pos="12240"/>
-        </w:tabs>
-        <w:spacing w:after="0" w:before="0" w:line="240" w:lineRule="auto"/>
-        <w:ind w:firstLine="0" w:left="0"/>
-        <w:contextualSpacing w:val="false"/>
-        <w:jc w:val="left"/>
-        <w:rPr>
-          <w:rFonts w:ascii="Times New Roman" w:hAnsi="Times New Roman" w:cs="Times New Roman"/>
-          <w:b/>
-          <w:bCs/>
-          <w:color w:val="000000" w:themeColor="text1"/>
-          <w:sz w:val="22"/>
-          <w:szCs w:val="22"/>
-          <w:u w:val="none"/>
-        </w:rPr>
-      </w:pPr>
-      <w:r>
-        <w:rPr>
-          <w:rFonts w:ascii="Times New Roman" w:hAnsi="Times New Roman" w:eastAsia="Times New Roman" w:cs="Times New Roman"/>
-          <w:b/>
-          <w:bCs/>
-          <w:color w:val="000000" w:themeColor="text1"/>
-          <w:sz w:val="22"/>
-          <w:szCs w:val="22"/>
-          <w:u w:val="none"/>
-        </w:rPr>
-        <w:t xml:space="preserve">YT</w:t>
-        <w:tab/>
-        <w:t xml:space="preserve">March 2022 </w:t>
-      </w:r>
-      <w:r>
-        <w:rPr>
-          <w:rFonts w:ascii="Times New Roman" w:hAnsi="Times New Roman" w:eastAsia="Times New Roman" w:cs="Times New Roman"/>
-          <w:b/>
-          <w:bCs/>
-          <w:i w:val="0"/>
-          <w:iCs w:val="0"/>
-          <w:color w:val="000000" w:themeColor="text1"/>
-          <w:sz w:val="22"/>
-          <w:szCs w:val="22"/>
-        </w:rPr>
-        <w:t xml:space="preserve">–</w:t>
-      </w:r>
-      <w:r>
-        <w:rPr>
-          <w:rFonts w:ascii="Times New Roman" w:hAnsi="Times New Roman" w:eastAsia="Times New Roman" w:cs="Times New Roman"/>
-          <w:b/>
-          <w:bCs/>
-          <w:color w:val="000000" w:themeColor="text1"/>
-          <w:sz w:val="22"/>
-          <w:szCs w:val="22"/>
-          <w:u w:val="none"/>
-        </w:rPr>
-        <w:t xml:space="preserve"> December 2023</w:t>
-      </w:r>
-      <w:r>
-        <w:rPr>
-          <w:rFonts w:ascii="Times New Roman" w:hAnsi="Times New Roman" w:cs="Times New Roman"/>
-          <w:b/>
-          <w:bCs/>
-          <w:color w:val="000000" w:themeColor="text1"/>
-          <w:sz w:val="22"/>
-          <w:szCs w:val="22"/>
-          <w:u w:val="none"/>
-        </w:rPr>
-      </w:r>
-      <w:r>
-        <w:rPr>
-          <w:rFonts w:ascii="Times New Roman" w:hAnsi="Times New Roman" w:cs="Times New Roman"/>
-          <w:b/>
-          <w:bCs/>
-          <w:color w:val="000000" w:themeColor="text1"/>
-          <w:sz w:val="22"/>
-          <w:szCs w:val="22"/>
-          <w:u w:val="none"/>
-        </w:rPr>
-      </w:r>
-    </w:p>
-    <w:p>
-      <w:pPr>
-        <w:pStyle w:val="1009"/>
-        <w:keepNext w:val="false"/>
-        <w:keepLines w:val="true"/>
-        <w:suppressLineNumbers w:val="false"/>
-        <w:pBdr/>
-        <w:tabs>
-          <w:tab w:val="right" w:leader="none" w:pos="11520"/>
-          <w:tab w:val="right" w:leader="none" w:pos="12240"/>
-        </w:tabs>
-        <w:spacing w:after="0" w:before="0" w:line="240" w:lineRule="auto"/>
-        <w:ind w:firstLine="0" w:left="0"/>
-        <w:contextualSpacing w:val="false"/>
-        <w:jc w:val="left"/>
-        <w:rPr>
-          <w:rFonts w:ascii="Times New Roman" w:hAnsi="Times New Roman" w:eastAsia="Times New Roman" w:cs="Times New Roman"/>
-          <w:b w:val="0"/>
-          <w:bCs w:val="0"/>
-          <w:i w:val="0"/>
-          <w:color w:val="000000" w:themeColor="text1"/>
-          <w:sz w:val="22"/>
-          <w:szCs w:val="22"/>
-          <w:highlight w:val="none"/>
-        </w:rPr>
-      </w:pPr>
-      <w:r>
-        <w:rPr>
-          <w:rFonts w:ascii="Times New Roman" w:hAnsi="Times New Roman" w:eastAsia="Times New Roman" w:cs="Times New Roman"/>
-          <w:b w:val="0"/>
-          <w:bCs w:val="0"/>
-          <w:i/>
-          <w:iCs/>
-          <w:color w:val="000000" w:themeColor="text1"/>
-          <w:sz w:val="22"/>
-          <w:szCs w:val="22"/>
-        </w:rPr>
-        <w:t xml:space="preserve">YouTube command line interface made in PowerShell</w:t>
-        <w:tab/>
-      </w:r>
-      <w:r>
-        <w:rPr>
-          <w:rFonts w:ascii="Times New Roman" w:hAnsi="Times New Roman" w:eastAsia="Times New Roman" w:cs="Times New Roman"/>
-          <w:b w:val="0"/>
-          <w:bCs w:val="0"/>
-          <w:color w:val="000000" w:themeColor="text1"/>
-          <w:sz w:val="22"/>
-          <w:szCs w:val="22"/>
-          <w:u w:val="none"/>
-        </w:rPr>
-      </w:r>
-      <w:hyperlink r:id="rId15" w:tooltip="https://github.com/mrf-dot/yt" w:history="1">
-        <w:r>
-          <w:rPr>
-            <w:rStyle w:val="988"/>
-            <w:rFonts w:ascii="Times New Roman" w:hAnsi="Times New Roman" w:eastAsia="Times New Roman" w:cs="Times New Roman"/>
-            <w:b w:val="0"/>
-            <w:bCs w:val="0"/>
-            <w:color w:val="000000" w:themeColor="text1"/>
-            <w:sz w:val="22"/>
-            <w:szCs w:val="22"/>
-            <w:u w:val="none"/>
-          </w:rPr>
-          <w:t xml:space="preserve">github</w:t>
-        </w:r>
-        <w:r>
-          <w:rPr>
-            <w:rStyle w:val="988"/>
-            <w:rFonts w:ascii="Times New Roman" w:hAnsi="Times New Roman" w:eastAsia="Times New Roman" w:cs="Times New Roman"/>
-            <w:b w:val="0"/>
-            <w:bCs w:val="0"/>
-            <w:color w:val="000000" w:themeColor="text1"/>
-            <w:sz w:val="22"/>
-            <w:szCs w:val="22"/>
-            <w:u w:val="none"/>
-          </w:rPr>
-        </w:r>
-        <w:r>
-          <w:rPr>
-            <w:rStyle w:val="988"/>
-            <w:rFonts w:ascii="Times New Roman" w:hAnsi="Times New Roman" w:eastAsia="Times New Roman" w:cs="Times New Roman"/>
-            <w:b w:val="0"/>
-            <w:bCs w:val="0"/>
-            <w:color w:val="000000" w:themeColor="text1"/>
-            <w:sz w:val="22"/>
-            <w:szCs w:val="22"/>
-            <w:u w:val="none"/>
-          </w:rPr>
-          <w:t xml:space="preserve">.com/mrf-dot/yt</w:t>
-        </w:r>
-      </w:hyperlink>
-      <w:r>
-        <w:rPr>
-          <w:rFonts w:ascii="Times New Roman" w:hAnsi="Times New Roman" w:eastAsia="Times New Roman" w:cs="Times New Roman"/>
-          <w:b w:val="0"/>
-          <w:bCs w:val="0"/>
-          <w:i w:val="0"/>
-          <w:color w:val="000000" w:themeColor="text1"/>
-          <w:sz w:val="22"/>
-          <w:szCs w:val="22"/>
-          <w:highlight w:val="none"/>
-        </w:rPr>
-      </w:r>
-      <w:r>
-        <w:rPr>
-          <w:rFonts w:ascii="Times New Roman" w:hAnsi="Times New Roman" w:eastAsia="Times New Roman" w:cs="Times New Roman"/>
-          <w:b w:val="0"/>
-          <w:bCs w:val="0"/>
-          <w:i w:val="0"/>
-          <w:color w:val="000000" w:themeColor="text1"/>
-          <w:sz w:val="22"/>
-          <w:szCs w:val="22"/>
-          <w:highlight w:val="none"/>
-        </w:rPr>
-      </w:r>
-    </w:p>
-    <w:p>
-      <w:pPr>
-        <w:pStyle w:val="1009"/>
-        <w:keepNext w:val="false"/>
-        <w:keepLines w:val="true"/>
-        <w:numPr>
-          <w:ilvl w:val="0"/>
-          <w:numId w:val="54"/>
-        </w:numPr>
-        <w:suppressLineNumbers w:val="false"/>
-        <w:pBdr/>
-        <w:tabs>
-          <w:tab w:val="right" w:leader="none" w:pos="12240"/>
-        </w:tabs>
-        <w:spacing w:after="0" w:before="0" w:line="240" w:lineRule="auto"/>
-        <w:ind/>
-        <w:contextualSpacing w:val="false"/>
-        <w:jc w:val="left"/>
-        <w:rPr>
-          <w:rFonts w:ascii="Times New Roman" w:hAnsi="Times New Roman" w:eastAsia="Times New Roman" w:cs="Times New Roman"/>
-          <w:b w:val="0"/>
-          <w:bCs w:val="0"/>
-          <w:i w:val="0"/>
-          <w:color w:val="000000" w:themeColor="text1"/>
-          <w:sz w:val="22"/>
-          <w:szCs w:val="22"/>
-          <w:highlight w:val="none"/>
-        </w:rPr>
-      </w:pPr>
-      <w:r>
-        <w:rPr>
-          <w:rFonts w:ascii="Times New Roman" w:hAnsi="Times New Roman" w:eastAsia="Times New Roman" w:cs="Times New Roman"/>
-          <w:b w:val="0"/>
-          <w:bCs w:val="0"/>
-          <w:i w:val="0"/>
-          <w:iCs w:val="0"/>
-          <w:color w:val="000000" w:themeColor="text1"/>
-          <w:sz w:val="22"/>
-          <w:szCs w:val="22"/>
-          <w:highlight w:val="none"/>
-        </w:rPr>
-        <w:t xml:space="preserve">PowerShell script that allows a user to watch and download YouTube videos using a CLI. </w:t>
-      </w:r>
-      <w:r>
-        <w:rPr>
-          <w:rFonts w:ascii="Times New Roman" w:hAnsi="Times New Roman" w:eastAsia="Times New Roman" w:cs="Times New Roman"/>
-          <w:b w:val="0"/>
-          <w:bCs w:val="0"/>
-          <w:i w:val="0"/>
-          <w:color w:val="000000" w:themeColor="text1"/>
-          <w:sz w:val="22"/>
-          <w:szCs w:val="22"/>
-          <w:highlight w:val="none"/>
-        </w:rPr>
-      </w:r>
-      <w:r>
-        <w:rPr>
-          <w:rFonts w:ascii="Times New Roman" w:hAnsi="Times New Roman" w:eastAsia="Times New Roman" w:cs="Times New Roman"/>
-          <w:b w:val="0"/>
-          <w:bCs w:val="0"/>
-          <w:i w:val="0"/>
-          <w:color w:val="000000" w:themeColor="text1"/>
-          <w:sz w:val="22"/>
-          <w:szCs w:val="22"/>
-          <w:highlight w:val="none"/>
-        </w:rPr>
-      </w:r>
-    </w:p>
-    <w:p>
-      <w:pPr>
-        <w:pStyle w:val="1009"/>
-        <w:keepNext w:val="false"/>
-        <w:keepLines w:val="true"/>
-        <w:suppressLineNumbers w:val="false"/>
-        <w:pBdr/>
-        <w:tabs>
-          <w:tab w:val="right" w:leader="none" w:pos="12240"/>
-        </w:tabs>
-        <w:spacing w:after="0" w:before="0" w:line="240" w:lineRule="auto"/>
-        <w:ind w:firstLine="0" w:left="0"/>
-        <w:contextualSpacing w:val="false"/>
-        <w:jc w:val="left"/>
-        <w:rPr>
-          <w:rFonts w:ascii="Times New Roman" w:hAnsi="Times New Roman" w:eastAsia="Times New Roman" w:cs="Times New Roman"/>
-          <w:b/>
-          <w:bCs/>
-          <w:i w:val="0"/>
-          <w:color w:val="000000" w:themeColor="text1"/>
-          <w:sz w:val="22"/>
-          <w:szCs w:val="22"/>
-          <w:highlight w:val="none"/>
-          <w:u w:val="none"/>
-        </w:rPr>
-      </w:pPr>
-      <w:r>
-        <w:rPr>
-          <w:rFonts w:ascii="Times New Roman" w:hAnsi="Times New Roman" w:eastAsia="Times New Roman" w:cs="Times New Roman"/>
-          <w:b/>
-          <w:bCs/>
-          <w:color w:val="000000" w:themeColor="text1"/>
-          <w:sz w:val="22"/>
-          <w:szCs w:val="22"/>
-          <w:highlight w:val="none"/>
-          <w:u w:val="none"/>
-        </w:rPr>
-      </w:r>
-      <w:r>
-        <w:rPr>
-          <w:rFonts w:ascii="Times New Roman" w:hAnsi="Times New Roman" w:eastAsia="Times New Roman" w:cs="Times New Roman"/>
-          <w:b/>
-          <w:bCs/>
-          <w:color w:val="000000" w:themeColor="text1"/>
-          <w:sz w:val="22"/>
-          <w:szCs w:val="22"/>
-          <w:u w:val="none"/>
-        </w:rPr>
-        <w:t xml:space="preserve">Blackjack</w:t>
-      </w:r>
-      <w:r>
-        <w:rPr>
-          <w:rFonts w:ascii="Times New Roman" w:hAnsi="Times New Roman" w:cs="Times New Roman"/>
-          <w:b/>
-          <w:bCs/>
-          <w:color w:val="000000" w:themeColor="text1"/>
-          <w:sz w:val="22"/>
-          <w:szCs w:val="22"/>
-        </w:rPr>
-        <w:tab/>
-        <w:t xml:space="preserve">September 2023</w:t>
-      </w:r>
-      <w:r>
-        <w:rPr>
-          <w:rFonts w:ascii="Times New Roman" w:hAnsi="Times New Roman" w:eastAsia="Times New Roman" w:cs="Times New Roman"/>
-          <w:b/>
-          <w:bCs/>
-          <w:i w:val="0"/>
-          <w:iCs w:val="0"/>
-          <w:color w:val="000000" w:themeColor="text1"/>
-          <w:sz w:val="22"/>
-          <w:szCs w:val="22"/>
-        </w:rPr>
-        <w:t xml:space="preserve"> – April 2024</w:t>
-      </w:r>
-      <w:r>
-        <w:rPr>
-          <w:rFonts w:ascii="Times New Roman" w:hAnsi="Times New Roman" w:eastAsia="Times New Roman" w:cs="Times New Roman"/>
-          <w:b/>
-          <w:bCs/>
-          <w:i w:val="0"/>
-          <w:color w:val="000000" w:themeColor="text1"/>
-          <w:sz w:val="22"/>
-          <w:szCs w:val="22"/>
-          <w:highlight w:val="none"/>
-          <w:u w:val="none"/>
-        </w:rPr>
-      </w:r>
-      <w:r>
-        <w:rPr>
-          <w:rFonts w:ascii="Times New Roman" w:hAnsi="Times New Roman" w:eastAsia="Times New Roman" w:cs="Times New Roman"/>
-          <w:b/>
-          <w:bCs/>
-          <w:i w:val="0"/>
-          <w:color w:val="000000" w:themeColor="text1"/>
-          <w:sz w:val="22"/>
-          <w:szCs w:val="22"/>
-          <w:highlight w:val="none"/>
-          <w:u w:val="none"/>
-        </w:rPr>
-      </w:r>
-    </w:p>
-    <w:p>
-      <w:pPr>
-        <w:pStyle w:val="1009"/>
-        <w:keepNext w:val="false"/>
-        <w:keepLines w:val="true"/>
-        <w:suppressLineNumbers w:val="false"/>
-        <w:pBdr/>
-        <w:tabs>
-          <w:tab w:val="right" w:leader="none" w:pos="12240"/>
-        </w:tabs>
-        <w:spacing w:after="0" w:before="0" w:line="240" w:lineRule="auto"/>
-        <w:ind w:firstLine="0" w:left="0"/>
-        <w:contextualSpacing w:val="false"/>
-        <w:jc w:val="left"/>
-        <w:rPr>
-          <w:rFonts w:ascii="Times New Roman" w:hAnsi="Times New Roman" w:cs="Times New Roman"/>
-          <w:b w:val="0"/>
-          <w:bCs w:val="0"/>
-          <w:color w:val="000000" w:themeColor="text1"/>
-          <w:sz w:val="22"/>
-          <w:szCs w:val="22"/>
-          <w:u w:val="none"/>
-        </w:rPr>
-      </w:pPr>
-      <w:r>
-        <w:rPr>
-          <w:rFonts w:ascii="Times New Roman" w:hAnsi="Times New Roman" w:eastAsia="Times New Roman" w:cs="Times New Roman"/>
-          <w:b w:val="0"/>
-          <w:bCs w:val="0"/>
-          <w:color w:val="000000" w:themeColor="text1"/>
-          <w:sz w:val="22"/>
-          <w:szCs w:val="22"/>
-          <w:highlight w:val="none"/>
-          <w:u w:val="none"/>
-        </w:rPr>
-      </w:r>
-      <w:r>
-        <w:rPr>
-          <w:rFonts w:ascii="Times New Roman" w:hAnsi="Times New Roman" w:eastAsia="Times New Roman" w:cs="Times New Roman"/>
-          <w:b w:val="0"/>
-          <w:bCs w:val="0"/>
-          <w:i/>
-          <w:iCs/>
-          <w:color w:val="000000" w:themeColor="text1"/>
-          <w:sz w:val="22"/>
-          <w:szCs w:val="22"/>
-          <w:u w:val="none"/>
-        </w:rPr>
-        <w:t xml:space="preserve">Multi-call card/blackjack program written in C</w:t>
-        <w:tab/>
-      </w:r>
-      <w:r>
-        <w:rPr>
-          <w:rFonts w:ascii="Times New Roman" w:hAnsi="Times New Roman" w:eastAsia="Times New Roman" w:cs="Times New Roman"/>
-          <w:b w:val="0"/>
-          <w:bCs w:val="0"/>
-          <w:color w:val="000000" w:themeColor="text1"/>
-          <w:sz w:val="22"/>
-          <w:szCs w:val="22"/>
-          <w:u w:val="none"/>
-        </w:rPr>
-      </w:r>
-      <w:hyperlink r:id="rId16" w:tooltip="https://github.com/mrf-dot/blackjack" w:history="1">
-        <w:r>
-          <w:rPr>
-            <w:rStyle w:val="988"/>
-            <w:rFonts w:ascii="Times New Roman" w:hAnsi="Times New Roman" w:eastAsia="Times New Roman" w:cs="Times New Roman"/>
-            <w:b w:val="0"/>
-            <w:bCs w:val="0"/>
-            <w:color w:val="000000" w:themeColor="text1"/>
-            <w:sz w:val="22"/>
-            <w:szCs w:val="22"/>
-            <w:u w:val="none"/>
-          </w:rPr>
-          <w:t xml:space="preserve">github.com/mrf-dot/blackjack</w:t>
-        </w:r>
-      </w:hyperlink>
-      <w:r>
-        <w:rPr>
-          <w:rFonts w:ascii="Times New Roman" w:hAnsi="Times New Roman" w:cs="Times New Roman"/>
-          <w:b w:val="0"/>
-          <w:bCs w:val="0"/>
-          <w:color w:val="000000" w:themeColor="text1"/>
-          <w:sz w:val="22"/>
-          <w:szCs w:val="22"/>
-          <w:u w:val="none"/>
-        </w:rPr>
-      </w:r>
-      <w:r>
-        <w:rPr>
-          <w:rFonts w:ascii="Times New Roman" w:hAnsi="Times New Roman" w:cs="Times New Roman"/>
-          <w:b w:val="0"/>
-          <w:bCs w:val="0"/>
-          <w:color w:val="000000" w:themeColor="text1"/>
-          <w:sz w:val="22"/>
-          <w:szCs w:val="22"/>
-          <w:u w:val="none"/>
-        </w:rPr>
-      </w:r>
-    </w:p>
-    <w:p>
-      <w:pPr>
-        <w:pStyle w:val="1009"/>
-        <w:keepNext w:val="false"/>
-        <w:keepLines w:val="true"/>
-        <w:numPr>
-          <w:ilvl w:val="0"/>
-          <w:numId w:val="55"/>
-        </w:numPr>
-        <w:suppressLineNumbers w:val="false"/>
-        <w:pBdr/>
-        <w:tabs>
-          <w:tab w:val="right" w:leader="none" w:pos="12240"/>
-        </w:tabs>
-        <w:spacing w:after="0" w:before="0" w:line="240" w:lineRule="auto"/>
-        <w:ind/>
-        <w:contextualSpacing w:val="false"/>
-        <w:jc w:val="left"/>
-        <w:rPr>
-          <w:rFonts w:ascii="Times New Roman" w:hAnsi="Times New Roman" w:cs="Times New Roman"/>
-          <w:b w:val="0"/>
-          <w:bCs w:val="0"/>
-          <w:i w:val="0"/>
-          <w:color w:val="000000" w:themeColor="text1"/>
-          <w:sz w:val="22"/>
-          <w:szCs w:val="22"/>
-          <w:highlight w:val="none"/>
-        </w:rPr>
-      </w:pPr>
-      <w:r>
-        <w:rPr>
-          <w:rFonts w:ascii="Times New Roman" w:hAnsi="Times New Roman" w:cs="Times New Roman"/>
-          <w:b w:val="0"/>
-          <w:bCs w:val="0"/>
-          <w:i w:val="0"/>
-          <w:iCs w:val="0"/>
-          <w:color w:val="000000" w:themeColor="text1"/>
-          <w:sz w:val="22"/>
-          <w:szCs w:val="22"/>
-        </w:rPr>
-        <w:t xml:space="preserve">C</w:t>
-      </w:r>
-      <w:r>
-        <w:rPr>
-          <w:rFonts w:ascii="Times New Roman" w:hAnsi="Times New Roman" w:cs="Times New Roman"/>
-          <w:b w:val="0"/>
-          <w:bCs w:val="0"/>
-          <w:i w:val="0"/>
-          <w:iCs w:val="0"/>
-          <w:color w:val="000000" w:themeColor="text1"/>
-          <w:sz w:val="22"/>
-          <w:szCs w:val="22"/>
-        </w:rPr>
-        <w:t xml:space="preserve">LI program performing various functions on a virtual deck such as picking a random card and shuffling.</w:t>
-      </w:r>
-      <w:r>
-        <w:rPr>
-          <w:rFonts w:ascii="Times New Roman" w:hAnsi="Times New Roman" w:cs="Times New Roman"/>
-          <w:b w:val="0"/>
-          <w:bCs w:val="0"/>
-          <w:i w:val="0"/>
-          <w:color w:val="000000" w:themeColor="text1"/>
-          <w:sz w:val="22"/>
-          <w:szCs w:val="22"/>
-          <w:highlight w:val="none"/>
-        </w:rPr>
-      </w:r>
-      <w:r>
-        <w:rPr>
-          <w:rFonts w:ascii="Times New Roman" w:hAnsi="Times New Roman" w:cs="Times New Roman"/>
-          <w:b w:val="0"/>
-          <w:bCs w:val="0"/>
-          <w:i w:val="0"/>
-          <w:color w:val="000000" w:themeColor="text1"/>
-          <w:sz w:val="22"/>
-          <w:szCs w:val="22"/>
-          <w:highlight w:val="none"/>
-        </w:rPr>
-      </w:r>
-    </w:p>
-    <w:p>
-      <w:pPr>
-        <w:pStyle w:val="1009"/>
-        <w:keepNext w:val="false"/>
-        <w:keepLines w:val="true"/>
-        <w:numPr>
-          <w:ilvl w:val="0"/>
-          <w:numId w:val="55"/>
-        </w:numPr>
-        <w:suppressLineNumbers w:val="false"/>
-        <w:pBdr/>
-        <w:tabs>
-          <w:tab w:val="right" w:leader="none" w:pos="12240"/>
-        </w:tabs>
-        <w:spacing w:after="0" w:before="0" w:line="360" w:lineRule="auto"/>
-        <w:ind/>
-        <w:contextualSpacing w:val="false"/>
-        <w:jc w:val="left"/>
-        <w:rPr>
-          <w:rFonts w:ascii="Times New Roman" w:hAnsi="Times New Roman" w:cs="Times New Roman"/>
-          <w:b w:val="0"/>
-          <w:bCs w:val="0"/>
-          <w:i w:val="0"/>
-          <w:color w:val="000000" w:themeColor="text1"/>
-          <w:sz w:val="22"/>
-          <w:szCs w:val="22"/>
-        </w:rPr>
-      </w:pPr>
-      <w:r>
-        <w:rPr>
-          <w:rFonts w:ascii="Times New Roman" w:hAnsi="Times New Roman" w:cs="Times New Roman"/>
-          <w:b w:val="0"/>
-          <w:bCs w:val="0"/>
-          <w:i w:val="0"/>
-          <w:iCs w:val="0"/>
-          <w:color w:val="000000" w:themeColor="text1"/>
-          <w:sz w:val="22"/>
-          <w:szCs w:val="22"/>
-        </w:rPr>
-        <w:t xml:space="preserve">Utilizes a custom-made randomness library based on the Xorshift algorithm linked at compile time.</w:t>
-      </w:r>
-      <w:r>
-        <w:rPr>
-          <w:rFonts w:ascii="Times New Roman" w:hAnsi="Times New Roman" w:cs="Times New Roman"/>
-          <w:b w:val="0"/>
-          <w:bCs w:val="0"/>
-          <w:i w:val="0"/>
-          <w:color w:val="000000" w:themeColor="text1"/>
-          <w:sz w:val="22"/>
-          <w:szCs w:val="22"/>
-        </w:rPr>
-      </w:r>
-      <w:r>
-        <w:rPr>
-          <w:rFonts w:ascii="Times New Roman" w:hAnsi="Times New Roman" w:cs="Times New Roman"/>
-          <w:b w:val="0"/>
-          <w:bCs w:val="0"/>
-          <w:i w:val="0"/>
-          <w:color w:val="000000" w:themeColor="text1"/>
-          <w:sz w:val="22"/>
-          <w:szCs w:val="22"/>
         </w:rPr>
       </w:r>
     </w:p>
@@ -3517,6 +3273,7 @@
           <w:bCs w:val="0"/>
           <w:sz w:val="22"/>
           <w:szCs w:val="22"/>
+          <w:highlight w:val="none"/>
         </w:rPr>
       </w:pPr>
       <w:r>
@@ -3576,6 +3333,69 @@
       </w:pPr>
       <w:r>
         <w:rPr>
+          <w:b/>
+          <w:bCs/>
+          <w:sz w:val="22"/>
+          <w:szCs w:val="22"/>
+          <w:highlight w:val="none"/>
+        </w:rPr>
+        <w:t xml:space="preserve">AI &amp; ML: </w:t>
+      </w:r>
+      <w:r>
+        <w:rPr>
+          <w:b w:val="0"/>
+          <w:bCs w:val="0"/>
+          <w:sz w:val="22"/>
+          <w:szCs w:val="22"/>
+          <w:highlight w:val="none"/>
+        </w:rPr>
+        <w:t xml:space="preserve">RAG, Azure Document Intelligence, Openclaw, Ollama, </w:t>
+      </w:r>
+      <w:r>
+        <w:rPr>
+          <w:b w:val="0"/>
+          <w:bCs w:val="0"/>
+          <w:sz w:val="22"/>
+          <w:szCs w:val="22"/>
+          <w:highlight w:val="none"/>
+        </w:rPr>
+        <w:t xml:space="preserve">OpenAI API, OpenRouter API</w:t>
+      </w:r>
+      <w:r/>
+      <w:r>
+        <w:rPr>
+          <w:b w:val="0"/>
+          <w:bCs w:val="0"/>
+          <w:sz w:val="22"/>
+          <w:szCs w:val="22"/>
+          <w:highlight w:val="none"/>
+        </w:rPr>
+      </w:r>
+      <w:r>
+        <w:rPr>
+          <w:b w:val="0"/>
+          <w:bCs w:val="0"/>
+          <w:sz w:val="22"/>
+          <w:szCs w:val="22"/>
+        </w:rPr>
+      </w:r>
+    </w:p>
+    <w:p>
+      <w:pPr>
+        <w:pStyle w:val="1009"/>
+        <w:pBdr/>
+        <w:spacing w:after="0" w:line="240" w:lineRule="auto"/>
+        <w:ind/>
+        <w:jc w:val="left"/>
+        <w:rPr>
+          <w:b w:val="0"/>
+          <w:bCs w:val="0"/>
+          <w:sz w:val="22"/>
+          <w:szCs w:val="22"/>
+        </w:rPr>
+      </w:pPr>
+      <w:r>
+        <w:rPr>
           <w:rFonts w:ascii="Times New Roman" w:hAnsi="Times New Roman" w:eastAsia="Times New Roman" w:cs="Times New Roman"/>
           <w:b/>
           <w:bCs/>
@@ -3596,7 +3416,7 @@
           <w:szCs w:val="22"/>
           <w:highlight w:val="none"/>
         </w:rPr>
-        <w:t xml:space="preserve"> ReactJS, Flask, PostgreSQL, OpenAI API, RAG, Azure Document Intelligence, Excel</w:t>
+        <w:t xml:space="preserve"> ReactJS, Flask, PostgreSQL, Excel</w:t>
       </w:r>
       <w:r>
         <w:rPr>
@@ -3605,6 +3425,7 @@
           <w:sz w:val="22"/>
           <w:szCs w:val="22"/>
         </w:rPr>
+        <w:t xml:space="preserve">, JSON</w:t>
       </w:r>
       <w:r>
         <w:rPr>
@@ -3683,37 +3504,6 @@
       </w:r>
       <w:r>
         <w:rPr>
-          <w:b/>
-          <w:bCs/>
-          <w:sz w:val="18"/>
-          <w:szCs w:val="18"/>
-          <w:highlight w:val="none"/>
-        </w:rPr>
-      </w:r>
-      <w:r>
-        <w:rPr>
-          <w:rFonts w:ascii="Times New Roman" w:hAnsi="Times New Roman" w:eastAsia="Times New Roman" w:cs="Times New Roman"/>
-          <w:b w:val="0"/>
-          <w:bCs w:val="0"/>
-          <w:color w:val="000000" w:themeColor="text1"/>
-          <w:sz w:val="22"/>
-          <w:szCs w:val="22"/>
-          <w:highlight w:val="none"/>
-        </w:rPr>
-      </w:r>
-      <w:r>
-        <w:rPr>
-          <w:rFonts w:ascii="Times New Roman" w:hAnsi="Times New Roman" w:eastAsia="Times New Roman" w:cs="Times New Roman"/>
-          <w:b w:val="0"/>
-          <w:bCs w:val="0"/>
-          <w:color w:val="000000" w:themeColor="text1"/>
-          <w:sz w:val="22"/>
-          <w:szCs w:val="22"/>
-          <w:highlight w:val="none"/>
-        </w:rPr>
-      </w:r>
-      <w:r>
-        <w:rPr>
           <w:rFonts w:ascii="Times New Roman" w:hAnsi="Times New Roman" w:eastAsia="Times New Roman" w:cs="Times New Roman"/>
           <w:b w:val="0"/>
           <w:bCs w:val="0"/>
@@ -12210,6 +12000,300 @@
       </w:pPr>
       <w:rPr>
         <w:rFonts w:hint="default" w:ascii="Symbol" w:hAnsi="Symbol" w:eastAsia="Symbol" w:cs="Symbol"/>
+      </w:rPr>
+      <w:start w:val="1"/>
+      <w:suff w:val="tab"/>
+    </w:lvl>
+    <w:lvl w:ilvl="1">
+      <w:isLgl w:val="false"/>
+      <w:lvlJc w:val="left"/>
+      <w:lvlText w:val="o"/>
+      <w:numFmt w:val="bullet"/>
+      <w:pPr>
+        <w:pBdr/>
+        <w:spacing/>
+        <w:ind w:hanging="360" w:left="1429"/>
+      </w:pPr>
+      <w:rPr>
+        <w:rFonts w:hint="default" w:ascii="Courier New" w:hAnsi="Courier New" w:eastAsia="Courier New" w:cs="Courier New"/>
+      </w:rPr>
+      <w:start w:val="1"/>
+      <w:suff w:val="tab"/>
+    </w:lvl>
+    <w:lvl w:ilvl="2">
+      <w:isLgl w:val="false"/>
+      <w:lvlJc w:val="left"/>
+      <w:lvlText w:val="§"/>
+      <w:numFmt w:val="bullet"/>
+      <w:pPr>
+        <w:pBdr/>
+        <w:spacing/>
+        <w:ind w:hanging="360" w:left="2149"/>
+      </w:pPr>
+      <w:rPr>
+        <w:rFonts w:hint="default" w:ascii="Wingdings" w:hAnsi="Wingdings" w:eastAsia="Wingdings" w:cs="Wingdings"/>
+      </w:rPr>
+      <w:start w:val="1"/>
+      <w:suff w:val="tab"/>
+    </w:lvl>
+    <w:lvl w:ilvl="3">
+      <w:isLgl w:val="false"/>
+      <w:lvlJc w:val="left"/>
+      <w:lvlText w:val="·"/>
+      <w:numFmt w:val="bullet"/>
+      <w:pPr>
+        <w:pBdr/>
+        <w:spacing/>
+        <w:ind w:hanging="360" w:left="2869"/>
+      </w:pPr>
+      <w:rPr>
+        <w:rFonts w:hint="default" w:ascii="Symbol" w:hAnsi="Symbol" w:eastAsia="Symbol" w:cs="Symbol"/>
+      </w:rPr>
+      <w:start w:val="1"/>
+      <w:suff w:val="tab"/>
+    </w:lvl>
+    <w:lvl w:ilvl="4">
+      <w:isLgl w:val="false"/>
+      <w:lvlJc w:val="left"/>
+      <w:lvlText w:val="o"/>
+      <w:numFmt w:val="bullet"/>
+      <w:pPr>
+        <w:pBdr/>
+        <w:spacing/>
+        <w:ind w:hanging="360" w:left="3589"/>
+      </w:pPr>
+      <w:rPr>
+        <w:rFonts w:hint="default" w:ascii="Courier New" w:hAnsi="Courier New" w:eastAsia="Courier New" w:cs="Courier New"/>
+      </w:rPr>
+      <w:start w:val="1"/>
+      <w:suff w:val="tab"/>
+    </w:lvl>
+    <w:lvl w:ilvl="5">
+      <w:isLgl w:val="false"/>
+      <w:lvlJc w:val="left"/>
+      <w:lvlText w:val="§"/>
+      <w:numFmt w:val="bullet"/>
+      <w:pPr>
+        <w:pBdr/>
+        <w:spacing/>
+        <w:ind w:hanging="360" w:left="4309"/>
+      </w:pPr>
+      <w:rPr>
+        <w:rFonts w:hint="default" w:ascii="Wingdings" w:hAnsi="Wingdings" w:eastAsia="Wingdings" w:cs="Wingdings"/>
+      </w:rPr>
+      <w:start w:val="1"/>
+      <w:suff w:val="tab"/>
+    </w:lvl>
+    <w:lvl w:ilvl="6">
+      <w:isLgl w:val="false"/>
+      <w:lvlJc w:val="left"/>
+      <w:lvlText w:val="·"/>
+      <w:numFmt w:val="bullet"/>
+      <w:pPr>
+        <w:pBdr/>
+        <w:spacing/>
+        <w:ind w:hanging="360" w:left="5029"/>
+      </w:pPr>
+      <w:rPr>
+        <w:rFonts w:hint="default" w:ascii="Symbol" w:hAnsi="Symbol" w:eastAsia="Symbol" w:cs="Symbol"/>
+      </w:rPr>
+      <w:start w:val="1"/>
+      <w:suff w:val="tab"/>
+    </w:lvl>
+    <w:lvl w:ilvl="7">
+      <w:isLgl w:val="false"/>
+      <w:lvlJc w:val="left"/>
+      <w:lvlText w:val="o"/>
+      <w:numFmt w:val="bullet"/>
+      <w:pPr>
+        <w:pBdr/>
+        <w:spacing/>
+        <w:ind w:hanging="360" w:left="5749"/>
+      </w:pPr>
+      <w:rPr>
+        <w:rFonts w:hint="default" w:ascii="Courier New" w:hAnsi="Courier New" w:eastAsia="Courier New" w:cs="Courier New"/>
+      </w:rPr>
+      <w:start w:val="1"/>
+      <w:suff w:val="tab"/>
+    </w:lvl>
+    <w:lvl w:ilvl="8">
+      <w:isLgl w:val="false"/>
+      <w:lvlJc w:val="left"/>
+      <w:lvlText w:val="§"/>
+      <w:numFmt w:val="bullet"/>
+      <w:pPr>
+        <w:pBdr/>
+        <w:spacing/>
+        <w:ind w:hanging="360" w:left="6469"/>
+      </w:pPr>
+      <w:rPr>
+        <w:rFonts w:hint="default" w:ascii="Wingdings" w:hAnsi="Wingdings" w:eastAsia="Wingdings" w:cs="Wingdings"/>
+      </w:rPr>
+      <w:start w:val="1"/>
+      <w:suff w:val="tab"/>
+    </w:lvl>
+  </w:abstractNum>
+  <w:abstractNum w:abstractNumId="59">
+    <w:nsid w:val="2333249F"/>
+    <w:lvl w:ilvl="0">
+      <w:isLgl w:val="false"/>
+      <w:lvlJc w:val="left"/>
+      <w:lvlText w:val="·"/>
+      <w:numFmt w:val="bullet"/>
+      <w:pPr>
+        <w:pBdr/>
+        <w:spacing/>
+        <w:ind w:hanging="360" w:left="709"/>
+      </w:pPr>
+      <w:rPr>
+        <w:rFonts w:hint="default" w:ascii="Symbol" w:hAnsi="Symbol" w:eastAsia="Symbol" w:cs="Symbol"/>
+      </w:rPr>
+      <w:start w:val="1"/>
+      <w:suff w:val="tab"/>
+    </w:lvl>
+    <w:lvl w:ilvl="1">
+      <w:isLgl w:val="false"/>
+      <w:lvlJc w:val="left"/>
+      <w:lvlText w:val="o"/>
+      <w:numFmt w:val="bullet"/>
+      <w:pPr>
+        <w:pBdr/>
+        <w:spacing/>
+        <w:ind w:hanging="360" w:left="1429"/>
+      </w:pPr>
+      <w:rPr>
+        <w:rFonts w:hint="default" w:ascii="Courier New" w:hAnsi="Courier New" w:eastAsia="Courier New" w:cs="Courier New"/>
+      </w:rPr>
+      <w:start w:val="1"/>
+      <w:suff w:val="tab"/>
+    </w:lvl>
+    <w:lvl w:ilvl="2">
+      <w:isLgl w:val="false"/>
+      <w:lvlJc w:val="left"/>
+      <w:lvlText w:val="§"/>
+      <w:numFmt w:val="bullet"/>
+      <w:pPr>
+        <w:pBdr/>
+        <w:spacing/>
+        <w:ind w:hanging="360" w:left="2149"/>
+      </w:pPr>
+      <w:rPr>
+        <w:rFonts w:hint="default" w:ascii="Wingdings" w:hAnsi="Wingdings" w:eastAsia="Wingdings" w:cs="Wingdings"/>
+      </w:rPr>
+      <w:start w:val="1"/>
+      <w:suff w:val="tab"/>
+    </w:lvl>
+    <w:lvl w:ilvl="3">
+      <w:isLgl w:val="false"/>
+      <w:lvlJc w:val="left"/>
+      <w:lvlText w:val="·"/>
+      <w:numFmt w:val="bullet"/>
+      <w:pPr>
+        <w:pBdr/>
+        <w:spacing/>
+        <w:ind w:hanging="360" w:left="2869"/>
+      </w:pPr>
+      <w:rPr>
+        <w:rFonts w:hint="default" w:ascii="Symbol" w:hAnsi="Symbol" w:eastAsia="Symbol" w:cs="Symbol"/>
+      </w:rPr>
+      <w:start w:val="1"/>
+      <w:suff w:val="tab"/>
+    </w:lvl>
+    <w:lvl w:ilvl="4">
+      <w:isLgl w:val="false"/>
+      <w:lvlJc w:val="left"/>
+      <w:lvlText w:val="o"/>
+      <w:numFmt w:val="bullet"/>
+      <w:pPr>
+        <w:pBdr/>
+        <w:spacing/>
+        <w:ind w:hanging="360" w:left="3589"/>
+      </w:pPr>
+      <w:rPr>
+        <w:rFonts w:hint="default" w:ascii="Courier New" w:hAnsi="Courier New" w:eastAsia="Courier New" w:cs="Courier New"/>
+      </w:rPr>
+      <w:start w:val="1"/>
+      <w:suff w:val="tab"/>
+    </w:lvl>
+    <w:lvl w:ilvl="5">
+      <w:isLgl w:val="false"/>
+      <w:lvlJc w:val="left"/>
+      <w:lvlText w:val="§"/>
+      <w:numFmt w:val="bullet"/>
+      <w:pPr>
+        <w:pBdr/>
+        <w:spacing/>
+        <w:ind w:hanging="360" w:left="4309"/>
+      </w:pPr>
+      <w:rPr>
+        <w:rFonts w:hint="default" w:ascii="Wingdings" w:hAnsi="Wingdings" w:eastAsia="Wingdings" w:cs="Wingdings"/>
+      </w:rPr>
+      <w:start w:val="1"/>
+      <w:suff w:val="tab"/>
+    </w:lvl>
+    <w:lvl w:ilvl="6">
+      <w:isLgl w:val="false"/>
+      <w:lvlJc w:val="left"/>
+      <w:lvlText w:val="·"/>
+      <w:numFmt w:val="bullet"/>
+      <w:pPr>
+        <w:pBdr/>
+        <w:spacing/>
+        <w:ind w:hanging="360" w:left="5029"/>
+      </w:pPr>
+      <w:rPr>
+        <w:rFonts w:hint="default" w:ascii="Symbol" w:hAnsi="Symbol" w:eastAsia="Symbol" w:cs="Symbol"/>
+      </w:rPr>
+      <w:start w:val="1"/>
+      <w:suff w:val="tab"/>
+    </w:lvl>
+    <w:lvl w:ilvl="7">
+      <w:isLgl w:val="false"/>
+      <w:lvlJc w:val="left"/>
+      <w:lvlText w:val="o"/>
+      <w:numFmt w:val="bullet"/>
+      <w:pPr>
+        <w:pBdr/>
+        <w:spacing/>
+        <w:ind w:hanging="360" w:left="5749"/>
+      </w:pPr>
+      <w:rPr>
+        <w:rFonts w:hint="default" w:ascii="Courier New" w:hAnsi="Courier New" w:eastAsia="Courier New" w:cs="Courier New"/>
+      </w:rPr>
+      <w:start w:val="1"/>
+      <w:suff w:val="tab"/>
+    </w:lvl>
+    <w:lvl w:ilvl="8">
+      <w:isLgl w:val="false"/>
+      <w:lvlJc w:val="left"/>
+      <w:lvlText w:val="§"/>
+      <w:numFmt w:val="bullet"/>
+      <w:pPr>
+        <w:pBdr/>
+        <w:spacing/>
+        <w:ind w:hanging="360" w:left="6469"/>
+      </w:pPr>
+      <w:rPr>
+        <w:rFonts w:hint="default" w:ascii="Wingdings" w:hAnsi="Wingdings" w:eastAsia="Wingdings" w:cs="Wingdings"/>
+      </w:rPr>
+      <w:start w:val="1"/>
+      <w:suff w:val="tab"/>
+    </w:lvl>
+  </w:abstractNum>
+  <w:abstractNum w:abstractNumId="60">
+    <w:nsid w:val="0FEE5754"/>
+    <w:lvl w:ilvl="0">
+      <w:isLgl w:val="false"/>
+      <w:lvlJc w:val="left"/>
+      <w:lvlText w:val="·"/>
+      <w:numFmt w:val="bullet"/>
+      <w:pPr>
+        <w:pBdr/>
+        <w:spacing/>
+        <w:ind w:hanging="360" w:left="709"/>
+      </w:pPr>
+      <w:rPr>
+        <w:rFonts w:ascii="Symbol" w:hAnsi="Symbol" w:eastAsia="Symbol" w:cs="Symbol"/>
       </w:rPr>
       <w:start w:val="1"/>
       <w:suff w:val="tab"/>
@@ -12519,6 +12603,12 @@
   </w:num>
   <w:num w:numId="59">
     <w:abstractNumId w:val="58"/>
+  </w:num>
+  <w:num w:numId="60">
+    <w:abstractNumId w:val="59"/>
+  </w:num>
+  <w:num w:numId="61">
+    <w:abstractNumId w:val="60"/>
   </w:num>
 </w:numbering>
 </file>

</xml_diff>